<commit_message>
Fix test-id parsing in mutation harness, recompute affected kill vectors; EMSE manuscript and supplement; replication package v2
Co-Authored-By: Claude Opus 5.5 <noreply@anthropic.com>
Claude-Session: https://claude.ai/code/session_01BZjJPdbxvnVxMrcgFoYMCh
</commit_message>
<xml_diff>
--- a/emse/EMSE_Manuscript.docx
+++ b/emse/EMSE_Manuscript.docx
@@ -123,7 +123,7 @@
           <w:i w:val="0"/>
           <w:sz w:val="21"/>
         </w:rPr>
-        <w:t xml:space="preserve"> On mutants, a single attempt reaches 0.74–0.92 of what the existing tests kill and eight attempts reach parity (1.01–1.10). On real faults, six attempts reveal only 0.10–0.15 of the faults, and all three models together 0.23. Most failing tests are wrong rather than revealing: 54–66% of attempts contain a test that fails on the faulty version, but only 4–5% reveal the fault. </w:t>
+        <w:t xml:space="preserve"> On mutants, a single attempt reaches 0.84–1.05 of what the existing tests kill and eight attempts exceed parity (1.15–1.20). On real faults, six attempts reveal only 0.10–0.15 of the faults, and all three models together 0.23. Most failing tests are wrong rather than revealing: 54–66% of attempts contain a test that fails on the faulty version, but only 4–5% reveal the fault. </w:t>
       </w:r>
       <w:r>
         <w:rPr>
@@ -453,7 +453,7 @@
           <w:b w:val="0"/>
           <w:i w:val="0"/>
         </w:rPr>
-        <w:t>We generated AST mutants (arithmetic, comparison and Boolean operator replacement, constant replacement, negation removal) for eleven modules of five libraries (toolz, boltons, humanize, cachetools, more-itertools), capped at 150 per module. A mutant is killed by a suite if a test that passes on the original fails on the mutant. The human baseline is the project's existing test file for the module. Reach is the module-level ratio of mutants killed by the LLM tests to mutants killed by the existing tests, among mutants killed by either, averaged over the 7 modules with at least 30 mutants (947 mutants in boltons, humanize, more-itertools and toolz); intervals resample modules (1,500 resamples). LLM tests that failed on the original code were discarded before mutation analysis.</w:t>
+        <w:t>We generated AST mutants (arithmetic, comparison and Boolean operator replacement, constant replacement, negation removal) for eleven modules of five libraries (toolz, boltons, humanize, cachetools, more-itertools), capped at 150 per module. A mutant is killed by a suite if a test that passes on the original fails on the mutant. The human baseline is the project's existing test file for the module. Reach is the module-level ratio of mutants killed by the LLM tests to mutants killed by the existing tests, among mutants killed by either, averaged over the 7 modules with at least 30 mutants (947 mutants in boltons, humanize, more-itertools and toolz); intervals resample modules (1,500 resamples). LLM tests that failed on the original code were discarded before mutation analysis. Passing tests were identified from JUnit XML reports; an earlier version of the harness read test names from console output, which truncated names containing spaces and missed coloured output, and the affected kill vectors (humanize, and 5 of 24 attempts on boltons/strutils) were recomputed from the stored generated tests without new model calls.</w:t>
       </w:r>
     </w:p>
     <w:p>
@@ -946,7 +946,7 @@
                 <w:i w:val="0"/>
                 <w:sz w:val="18"/>
               </w:rPr>
-              <w:t>0.90 (0.57–1.16)</w:t>
+              <w:t>1.02 (0.89–1.18)</w:t>
             </w:r>
           </w:p>
         </w:tc>
@@ -966,7 +966,7 @@
                 <w:i w:val="0"/>
                 <w:sz w:val="18"/>
               </w:rPr>
-              <w:t>1.05 (0.60–1.49)</w:t>
+              <w:t>1.10 (0.94–1.28)</w:t>
             </w:r>
           </w:p>
         </w:tc>
@@ -986,7 +986,7 @@
                 <w:i w:val="0"/>
                 <w:sz w:val="18"/>
               </w:rPr>
-              <w:t>1.09 (0.65–1.53)</w:t>
+              <w:t>1.17 (0.96–1.39)</w:t>
             </w:r>
           </w:p>
         </w:tc>
@@ -1006,7 +1006,7 @@
                 <w:i w:val="0"/>
                 <w:sz w:val="18"/>
               </w:rPr>
-              <w:t>1.10 (0.64–1.56)</w:t>
+              <w:t>1.19 (0.99–1.40)</w:t>
             </w:r>
           </w:p>
         </w:tc>
@@ -1047,7 +1047,7 @@
                 <w:i w:val="0"/>
                 <w:sz w:val="18"/>
               </w:rPr>
-              <w:t>0.92 (0.58–1.19)</w:t>
+              <w:t>1.05 (0.92–1.20)</w:t>
             </w:r>
           </w:p>
         </w:tc>
@@ -1067,7 +1067,7 @@
                 <w:i w:val="0"/>
                 <w:sz w:val="18"/>
               </w:rPr>
-              <w:t>0.98 (0.62–1.29)</w:t>
+              <w:t>1.13 (0.98–1.31)</w:t>
             </w:r>
           </w:p>
         </w:tc>
@@ -1087,7 +1087,7 @@
                 <w:i w:val="0"/>
                 <w:sz w:val="18"/>
               </w:rPr>
-              <w:t>1.02 (0.65–1.34)</w:t>
+              <w:t>1.17 (1.00–1.36)</w:t>
             </w:r>
           </w:p>
         </w:tc>
@@ -1107,7 +1107,7 @@
                 <w:i w:val="0"/>
                 <w:sz w:val="18"/>
               </w:rPr>
-              <w:t>1.04 (0.68–1.36)</w:t>
+              <w:t>1.20 (1.00–1.41)</w:t>
             </w:r>
           </w:p>
         </w:tc>
@@ -1154,7 +1154,7 @@
                 <w:i w:val="0"/>
                 <w:sz w:val="18"/>
               </w:rPr>
-              <w:t>0.74 (0.46–1.01)</w:t>
+              <w:t>0.84 (0.69–1.04)</w:t>
             </w:r>
           </w:p>
         </w:tc>
@@ -1177,7 +1177,7 @@
                 <w:i w:val="0"/>
                 <w:sz w:val="18"/>
               </w:rPr>
-              <w:t>0.86 (0.53–1.16)</w:t>
+              <w:t>1.00 (0.83–1.19)</w:t>
             </w:r>
           </w:p>
         </w:tc>
@@ -1200,7 +1200,7 @@
                 <w:i w:val="0"/>
                 <w:sz w:val="18"/>
               </w:rPr>
-              <w:t>0.94 (0.57–1.24)</w:t>
+              <w:t>1.08 (0.91–1.28)</w:t>
             </w:r>
           </w:p>
         </w:tc>
@@ -1223,7 +1223,7 @@
                 <w:i w:val="0"/>
                 <w:sz w:val="18"/>
               </w:rPr>
-              <w:t>1.01 (0.58–1.34)</w:t>
+              <w:t>1.15 (0.96–1.37)</w:t>
             </w:r>
           </w:p>
         </w:tc>
@@ -1243,7 +1243,7 @@
           <w:b w:val="0"/>
           <w:i w:val="0"/>
         </w:rPr>
-        <w:t>A single attempt reaches 0.74 to 0.92 of what the existing tests kill (Table 1, Fig. 1a). Reach rises with attempts and reaches parity at four to eight attempts (1.01–1.10 at K = 8). The intervals are wide because seven modules differ greatly: the existing tests kill from 0.47 to 0.93 of the mutants. The LLM tests are partly complementary to the existing tests: among mutants killed by either side, 16–18% are killed only by the LLM tests (K = 8). By the mutation measure, LLM-written tests are a substitute for the existing tests after a few attempts.</w:t>
+        <w:t>A single attempt reaches 0.84 to 1.05 of what the existing tests kill (Table 1, Fig. 1a). Reach rises with attempts; the Claude models are at parity after one attempt and DeepSeek after two, and all three exceed it at K = 8 (1.15–1.20). The intervals are wide because seven modules differ greatly: the existing tests kill from 0.47 to 0.93 of the mutants. The LLM tests are partly complementary to the existing tests: among mutants killed by either side, 17–18% are killed only by the LLM tests (K = 8). By the mutation measure, LLM-written tests are a substitute for the existing tests after one or two attempts.</w:t>
       </w:r>
     </w:p>
     <w:p>
@@ -2511,7 +2511,7 @@
           <w:b w:val="0"/>
           <w:i w:val="0"/>
         </w:rPr>
-        <w:t>LLM-written unit tests reach parity with existing tests on mutants after a few attempts but reveal about one real fault in seven, because most of their failures come from wrong expectations. Mutation scores overstate their fault-finding reach, and evaluations of generated tests should measure reach on real faults.</w:t>
+        <w:t>LLM-written unit tests reach or exceed parity with existing tests on mutants within one or two attempts but reveal about one real fault in seven, because most of their failures come from wrong expectations. Mutation scores overstate their fault-finding reach, and evaluations of generated tests should measure reach on real faults.</w:t>
       </w:r>
     </w:p>
     <w:p>

</xml_diff>